<commit_message>
main add old references back
</commit_message>
<xml_diff>
--- a/szakdoga-12-09.docx
+++ b/szakdoga-12-09.docx
@@ -5804,7 +5804,60 @@
         <w:rPr>
           <w:lang w:val="en-HU"/>
         </w:rPr>
-        <w:t>A kutatás ötlete a HSDSLab kutatócsoportból származik, ahol az egyik konzulensem, Dr. Molontay Roland szakmai iránymutatása mellett Murgás Levente úttörő munkái vezették be a mémek rendszerezett vizsgálatát a Műegyetemen. Murgás szakdolgozata (2023), majd tudományos közleménye (2024) a mém sablonok strukturális kategorizálására fókuszált, amely fontos módszertani előzményt biztosított jelen kutatáshoz: jól illusztrálta, hogy a mémek vizsgálata kvantitatív, adatvezérelt megközelítésekkel is lehetséges. A jelen dolgozat erre a szemléletre épít tovább, de a sablonszintű vizsgálat helyett márkamegjelenésre és tartalmi trendekre koncentrál.</w:t>
+        <w:t>A kutatás ötlete a HSDSLab kutatócsoportból származik, ahol az egyik konzulensem, Dr. Molontay Roland szakmai iránymutatása mellett Murgás Levente úttörő munkái vezették be a mémek rendszerezett vizsgálatát a Műegyetemen. Murgás szakdolgozata, majd tudományos közleménye</w:t>
+      </w:r>
+      <w:r>
+        <w:rPr>
+          <w:lang w:val="en-HU"/>
+        </w:rPr>
+        <w:t xml:space="preserve"> </w:t>
+      </w:r>
+      <w:r>
+        <w:rPr>
+          <w:lang w:val="en-HU"/>
+        </w:rPr>
+        <w:t>a mém sablonok strukturális kategorizálására fókuszált, amely fontos módszertani előzményt biztosított jelen kutatáshoz: jól illusztrálta, hogy a mémek vizsgálata kvantitatív, adatvezérelt megközelítésekkel is lehetséges</w:t>
+      </w:r>
+      <w:r>
+        <w:rPr>
+          <w:lang w:val="en-HU"/>
+        </w:rPr>
+        <w:fldChar w:fldCharType="begin"/>
+      </w:r>
+      <w:r>
+        <w:rPr>
+          <w:lang w:val="en-HU"/>
+        </w:rPr>
+        <w:instrText xml:space="preserve"> REF _Ref216166996 \r \h </w:instrText>
+      </w:r>
+      <w:r>
+        <w:rPr>
+          <w:lang w:val="en-HU"/>
+        </w:rPr>
+      </w:r>
+      <w:r>
+        <w:rPr>
+          <w:lang w:val="en-HU"/>
+        </w:rPr>
+        <w:fldChar w:fldCharType="separate"/>
+      </w:r>
+      <w:r>
+        <w:rPr>
+          <w:lang w:val="en-HU"/>
+        </w:rPr>
+        <w:t>[2.]</w:t>
+      </w:r>
+      <w:r>
+        <w:rPr>
+          <w:lang w:val="en-HU"/>
+        </w:rPr>
+        <w:fldChar w:fldCharType="end"/>
+      </w:r>
+      <w:r>
+        <w:rPr>
+          <w:lang w:val="en-HU"/>
+        </w:rPr>
+        <w:t>. A jelen dolgozat erre a szemléletre épít tovább, de a sablonszintű vizsgálat helyett márkamegjelenésre és tartalmi trendekre koncentrál.</w:t>
       </w:r>
     </w:p>
     <w:p>
@@ -5995,7 +6048,30 @@
         <w:rPr>
           <w:vertAlign w:val="superscript"/>
         </w:rPr>
-        <w:t>3</w:t>
+        <w:fldChar w:fldCharType="begin"/>
+      </w:r>
+      <w:r>
+        <w:instrText xml:space="preserve"> REF _Ref216167022 \r \h </w:instrText>
+      </w:r>
+      <w:r>
+        <w:rPr>
+          <w:vertAlign w:val="superscript"/>
+        </w:rPr>
+      </w:r>
+      <w:r>
+        <w:rPr>
+          <w:vertAlign w:val="superscript"/>
+        </w:rPr>
+        <w:fldChar w:fldCharType="separate"/>
+      </w:r>
+      <w:r>
+        <w:t>[3.]</w:t>
+      </w:r>
+      <w:r>
+        <w:rPr>
+          <w:vertAlign w:val="superscript"/>
+        </w:rPr>
+        <w:fldChar w:fldCharType="end"/>
       </w:r>
       <w:r>
         <w:t>.</w:t>
@@ -6039,30 +6115,31 @@
         <w:t>á</w:t>
       </w:r>
       <w:r>
-        <w:t>k a képet, és lokális jellemzőket emelnek ki, például éleket, textúrákat vagy összetettebb alakzatokat. A feldolgozás során az alacsony szintű vizuális információ fokozatosan magasabb szintű reprezentációvá alakul, hasonlóan ahhoz, ahogyan az emberi látórendszer is egyre összetettebb jellemzőket ismer fel.  A CNN-ek az elmúlt évtizedben meghatározó szerepet játszottak a számítógépes látás területén, és a legtöbb képalapú gépi tanulási feladat, például az objektu</w:t>
+        <w:t>k a képet, és lokális jellemzőket emelnek ki, például éleket, textúrákat vagy összetettebb alakzatokat. A feldolgozás során az alacsony szintű vizuális információ fokozatosan magasabb szintű reprezentációvá alakul, hasonlóan ahhoz, ahogyan az emberi látórendszer is egyre összetettebb jellemzőket ismer fel</w:t>
+      </w:r>
+      <w:r>
+        <w:fldChar w:fldCharType="begin"/>
+      </w:r>
+      <w:r>
+        <w:instrText xml:space="preserve"> REF _Ref216167095 \r \h </w:instrText>
+      </w:r>
+      <w:r>
+        <w:fldChar w:fldCharType="separate"/>
+      </w:r>
+      <w:r>
+        <w:t>[4.]</w:t>
+      </w:r>
+      <w:r>
+        <w:fldChar w:fldCharType="end"/>
+      </w:r>
+      <w:r>
+        <w:t>.  A CNN-ek az elmúlt évtizedben meghatározó szerepet játszottak a számítógépes látás területén, és a legtöbb képalapú gépi tanulási feladat, például az objektu</w:t>
       </w:r>
       <w:r>
         <w:t>m</w:t>
       </w:r>
       <w:r>
-        <w:t>felismerés, önvezető rendszerek ilyen architektúrákra épülnek</w:t>
-      </w:r>
-      <w:r>
-        <w:rPr>
-          <w:vertAlign w:val="superscript"/>
-        </w:rPr>
-        <w:t>4</w:t>
-      </w:r>
-      <w:r>
-        <w:t xml:space="preserve">. Ezért </w:t>
-      </w:r>
-      <w:proofErr w:type="gramStart"/>
-      <w:r>
-        <w:t>az  általam</w:t>
-      </w:r>
-      <w:proofErr w:type="gramEnd"/>
-      <w:r>
-        <w:t xml:space="preserve"> fejlesztett logófelismerő modell szintén egy </w:t>
+        <w:t xml:space="preserve">felismerés, önvezető rendszerek ilyen architektúrákra épülnek. Ezért az általam fejlesztett logófelismerő modell szintén egy </w:t>
       </w:r>
       <w:proofErr w:type="spellStart"/>
       <w:r>
@@ -6266,6 +6343,21 @@
         <w:t>x.</w:t>
       </w:r>
       <w:proofErr w:type="spellEnd"/>
+      <w:r>
+        <w:fldChar w:fldCharType="begin"/>
+      </w:r>
+      <w:r>
+        <w:instrText xml:space="preserve"> REF _Ref216167122 \r \h </w:instrText>
+      </w:r>
+      <w:r>
+        <w:fldChar w:fldCharType="separate"/>
+      </w:r>
+      <w:r>
+        <w:t>[5.]</w:t>
+      </w:r>
+      <w:r>
+        <w:fldChar w:fldCharType="end"/>
+      </w:r>
     </w:p>
     <w:p>
       <w:pPr>
@@ -6354,7 +6446,30 @@
         <w:rPr>
           <w:vertAlign w:val="superscript"/>
         </w:rPr>
-        <w:t>6</w:t>
+        <w:fldChar w:fldCharType="begin"/>
+      </w:r>
+      <w:r>
+        <w:instrText xml:space="preserve"> REF _Ref216167158 \r \h </w:instrText>
+      </w:r>
+      <w:r>
+        <w:rPr>
+          <w:vertAlign w:val="superscript"/>
+        </w:rPr>
+      </w:r>
+      <w:r>
+        <w:rPr>
+          <w:vertAlign w:val="superscript"/>
+        </w:rPr>
+        <w:fldChar w:fldCharType="separate"/>
+      </w:r>
+      <w:r>
+        <w:t>[6.]</w:t>
+      </w:r>
+      <w:r>
+        <w:rPr>
+          <w:vertAlign w:val="superscript"/>
+        </w:rPr>
+        <w:fldChar w:fldCharType="end"/>
       </w:r>
       <w:r>
         <w:t>.</w:t>
@@ -6654,7 +6769,48 @@
         <w:rPr>
           <w:lang w:val="en-HU"/>
         </w:rPr>
-        <w:t>A fejlesztéshez a PyTorch keretrendszert alkalmaztam, amely a mélytanulási kutatások egyik legelterjedtebb eszköze. Dinamikus számítási gráfjai, intuitív szintaxisa és a Torchvision modulban elérhető, kifejezetten képfeldolgozásra optimalizált funkciók lehetővé tették egy testreszabható, könnyen bővíthető architektúra kialakítását. A keretrendszer GPU-gyorsítással és széles modellkínálattal támogatja a gyors kísérletezést, ami különösen fontos volt a logófelismerési és multimodális elemzési komponensek összehasonlításakor.</w:t>
+        <w:t>A fejlesztéshez a PyTorch keretrendszert alkalmaztam, amely a mélytanulási kutatások egyik legelterjedtebb eszköze. Dinamikus számítási gráfjai, intuitív szintaxisa és a Torchvision modulban elérhető, kifejezetten képfeldolgozásra optimalizált funkciók lehetővé tették egy testreszabható, könnyen bővíthető architektúra kialakítását. A keretrendszer GPU-gyorsítással és széles modellkínálattal támogatja a gyors kísérletezést, ami különösen fontos volt a logófelismerési és multimodális elemzési komponensek összehasonlításakor</w:t>
+      </w:r>
+      <w:r>
+        <w:rPr>
+          <w:lang w:val="en-HU"/>
+        </w:rPr>
+        <w:fldChar w:fldCharType="begin"/>
+      </w:r>
+      <w:r>
+        <w:rPr>
+          <w:lang w:val="en-HU"/>
+        </w:rPr>
+        <w:instrText xml:space="preserve"> REF _Ref216167173 \r \h </w:instrText>
+      </w:r>
+      <w:r>
+        <w:rPr>
+          <w:lang w:val="en-HU"/>
+        </w:rPr>
+      </w:r>
+      <w:r>
+        <w:rPr>
+          <w:lang w:val="en-HU"/>
+        </w:rPr>
+        <w:fldChar w:fldCharType="separate"/>
+      </w:r>
+      <w:r>
+        <w:rPr>
+          <w:lang w:val="en-HU"/>
+        </w:rPr>
+        <w:t>[7.]</w:t>
+      </w:r>
+      <w:r>
+        <w:rPr>
+          <w:lang w:val="en-HU"/>
+        </w:rPr>
+        <w:fldChar w:fldCharType="end"/>
+      </w:r>
+      <w:r>
+        <w:rPr>
+          <w:lang w:val="en-HU"/>
+        </w:rPr>
+        <w:t>.</w:t>
       </w:r>
     </w:p>
     <w:p>
@@ -6667,14 +6823,13 @@
       </w:r>
       <w:proofErr w:type="spellEnd"/>
       <w:r>
-        <w:t xml:space="preserve"> Lightning</w:t>
-      </w:r>
-      <w:r>
-        <w:rPr>
-          <w:vertAlign w:val="superscript"/>
-        </w:rPr>
-        <w:t>8</w:t>
-      </w:r>
+        <w:t xml:space="preserve"> </w:t>
+      </w:r>
+      <w:proofErr w:type="spellStart"/>
+      <w:r>
+        <w:t>Lightning</w:t>
+      </w:r>
+      <w:proofErr w:type="spellEnd"/>
       <w:r>
         <w:t xml:space="preserve"> ezt a funkcionalitást strukturáltabb formában nyújtja, elkülönítve az adatfeldolgozást, a modellarchitektúrát, tanítási logikát és a tanítási infrastruktúrát. Ez az elkülönítés tisztább kódot eredményez</w:t>
       </w:r>
@@ -6701,6 +6856,21 @@
       </w:r>
       <w:r>
         <w:t>, vagy az egy köteges próbatanítás.</w:t>
+      </w:r>
+      <w:r>
+        <w:fldChar w:fldCharType="begin"/>
+      </w:r>
+      <w:r>
+        <w:instrText xml:space="preserve"> REF _Ref216167190 \r \h </w:instrText>
+      </w:r>
+      <w:r>
+        <w:fldChar w:fldCharType="separate"/>
+      </w:r>
+      <w:r>
+        <w:t>[8.]</w:t>
+      </w:r>
+      <w:r>
+        <w:fldChar w:fldCharType="end"/>
       </w:r>
     </w:p>
     <w:p>
@@ -6790,16 +6960,25 @@
       </w:r>
       <w:proofErr w:type="spellEnd"/>
       <w:r>
-        <w:t xml:space="preserve"> nevű weboldalról gyűjtöttem össze</w:t>
-      </w:r>
-      <w:r>
-        <w:rPr>
-          <w:vertAlign w:val="superscript"/>
-        </w:rPr>
-        <w:t>9</w:t>
-      </w:r>
-      <w:r>
-        <w:t xml:space="preserve">, amely egy rendszeresen frissülő, dinamikus toplista formájában tartja számon a világ száz legsikeresebb márkáját. Az így összeállított listát a beszámoló függelékében </w:t>
+        <w:t xml:space="preserve"> nevű weboldalról gyűjtöttem össze, amely egy rendszeresen frissülő, dinamikus toplista formájában tartja számon a világ száz legsikeresebb márkáját.</w:t>
+      </w:r>
+      <w:r>
+        <w:fldChar w:fldCharType="begin"/>
+      </w:r>
+      <w:r>
+        <w:instrText xml:space="preserve"> REF _Ref216167206 \r \h </w:instrText>
+      </w:r>
+      <w:r>
+        <w:fldChar w:fldCharType="separate"/>
+      </w:r>
+      <w:r>
+        <w:t>[9.]</w:t>
+      </w:r>
+      <w:r>
+        <w:fldChar w:fldCharType="end"/>
+      </w:r>
+      <w:r>
+        <w:t xml:space="preserve"> Az így összeállított listát a beszámoló függelékében </w:t>
       </w:r>
       <w:r>
         <w:t xml:space="preserve">(5.1) </w:t>
@@ -7019,7 +7198,83 @@
           <w:lang w:val="en-HU" w:eastAsia="en-GB"/>
         </w:rPr>
         <w:lastRenderedPageBreak/>
-        <w:t xml:space="preserve">A hiányzó statikus logóképek pótlására webscrapinget alkalmaztam a BeautifulSoup és a Selenium könyvtárak segítségével, amelyekkel a márkák hivatalos elnevezéseire, köznyelvi változataira és OCR-variánsaira keresve nagy mennyiségű, jó minőségű logókép volt kinyerhető többek között a Bing és Pinterest platformokról. Mivel a kizárólag izolált logók nem biztosítottak megfelelő vizuális változatosságot, </w:t>
+        <w:t>A hiányzó statikus logóképek pótlására webscrapinget alkalmaztam a BeautifulSoup és a Selenium könyvtárak segítségével, amelyekkel a márkák hivatalos elnevezéseire, köznyelvi változataira és OCR-variánsaira keresve nagy mennyiségű, jó minőségű logókép volt kinyerhető többek között a Bing és Pinterest platformokról.</w:t>
+      </w:r>
+      <w:r>
+        <w:rPr>
+          <w:lang w:val="en-HU" w:eastAsia="en-GB"/>
+        </w:rPr>
+        <w:fldChar w:fldCharType="begin"/>
+      </w:r>
+      <w:r>
+        <w:rPr>
+          <w:lang w:val="en-HU" w:eastAsia="en-GB"/>
+        </w:rPr>
+        <w:instrText xml:space="preserve"> REF _Ref216167244 \r \h </w:instrText>
+      </w:r>
+      <w:r>
+        <w:rPr>
+          <w:lang w:val="en-HU" w:eastAsia="en-GB"/>
+        </w:rPr>
+      </w:r>
+      <w:r>
+        <w:rPr>
+          <w:lang w:val="en-HU" w:eastAsia="en-GB"/>
+        </w:rPr>
+        <w:fldChar w:fldCharType="separate"/>
+      </w:r>
+      <w:r>
+        <w:rPr>
+          <w:lang w:val="en-HU" w:eastAsia="en-GB"/>
+        </w:rPr>
+        <w:t>[10.]</w:t>
+      </w:r>
+      <w:r>
+        <w:rPr>
+          <w:lang w:val="en-HU" w:eastAsia="en-GB"/>
+        </w:rPr>
+        <w:fldChar w:fldCharType="end"/>
+      </w:r>
+      <w:r>
+        <w:rPr>
+          <w:lang w:val="en-HU" w:eastAsia="en-GB"/>
+        </w:rPr>
+        <w:fldChar w:fldCharType="begin"/>
+      </w:r>
+      <w:r>
+        <w:rPr>
+          <w:lang w:val="en-HU" w:eastAsia="en-GB"/>
+        </w:rPr>
+        <w:instrText xml:space="preserve"> REF _Ref216167246 \r \h </w:instrText>
+      </w:r>
+      <w:r>
+        <w:rPr>
+          <w:lang w:val="en-HU" w:eastAsia="en-GB"/>
+        </w:rPr>
+      </w:r>
+      <w:r>
+        <w:rPr>
+          <w:lang w:val="en-HU" w:eastAsia="en-GB"/>
+        </w:rPr>
+        <w:fldChar w:fldCharType="separate"/>
+      </w:r>
+      <w:r>
+        <w:rPr>
+          <w:lang w:val="en-HU" w:eastAsia="en-GB"/>
+        </w:rPr>
+        <w:t>[11.]</w:t>
+      </w:r>
+      <w:r>
+        <w:rPr>
+          <w:lang w:val="en-HU" w:eastAsia="en-GB"/>
+        </w:rPr>
+        <w:fldChar w:fldCharType="end"/>
+      </w:r>
+      <w:r>
+        <w:rPr>
+          <w:lang w:val="en-HU" w:eastAsia="en-GB"/>
+        </w:rPr>
+        <w:t xml:space="preserve"> Mivel a kizárólag izolált logók nem biztosítottak megfelelő vizuális változatosságot, </w:t>
       </w:r>
       <w:r>
         <w:rPr>
@@ -7033,7 +7288,83 @@
         <w:rPr>
           <w:lang w:val="en-HU" w:eastAsia="en-GB"/>
         </w:rPr>
-        <w:t xml:space="preserve"> is bevontam: a Reddit archívumából gyűjtöttem természetes környezetben megjelenő logóképeket a Pushshift rendszer segítségével. Az így összeállított, mintegy tízezer elemű tanító- és validáló adatbázis kellő heterogenitást biztosított a modell tanulásához.</w:t>
+        <w:t xml:space="preserve"> is bevontam: a Reddit archívumából gyűjtöttem természetes környezetben megjelenő logóképeket a Pushshift rendszer segítségével.</w:t>
+      </w:r>
+      <w:r>
+        <w:rPr>
+          <w:lang w:val="en-HU" w:eastAsia="en-GB"/>
+        </w:rPr>
+        <w:fldChar w:fldCharType="begin"/>
+      </w:r>
+      <w:r>
+        <w:rPr>
+          <w:lang w:val="en-HU" w:eastAsia="en-GB"/>
+        </w:rPr>
+        <w:instrText xml:space="preserve"> REF _Ref216167309 \r \h </w:instrText>
+      </w:r>
+      <w:r>
+        <w:rPr>
+          <w:lang w:val="en-HU" w:eastAsia="en-GB"/>
+        </w:rPr>
+      </w:r>
+      <w:r>
+        <w:rPr>
+          <w:lang w:val="en-HU" w:eastAsia="en-GB"/>
+        </w:rPr>
+        <w:fldChar w:fldCharType="separate"/>
+      </w:r>
+      <w:r>
+        <w:rPr>
+          <w:lang w:val="en-HU" w:eastAsia="en-GB"/>
+        </w:rPr>
+        <w:t>[12.]</w:t>
+      </w:r>
+      <w:r>
+        <w:rPr>
+          <w:lang w:val="en-HU" w:eastAsia="en-GB"/>
+        </w:rPr>
+        <w:fldChar w:fldCharType="end"/>
+      </w:r>
+      <w:r>
+        <w:rPr>
+          <w:lang w:val="en-HU" w:eastAsia="en-GB"/>
+        </w:rPr>
+        <w:fldChar w:fldCharType="begin"/>
+      </w:r>
+      <w:r>
+        <w:rPr>
+          <w:lang w:val="en-HU" w:eastAsia="en-GB"/>
+        </w:rPr>
+        <w:instrText xml:space="preserve"> REF _Ref216167313 \r \h </w:instrText>
+      </w:r>
+      <w:r>
+        <w:rPr>
+          <w:lang w:val="en-HU" w:eastAsia="en-GB"/>
+        </w:rPr>
+      </w:r>
+      <w:r>
+        <w:rPr>
+          <w:lang w:val="en-HU" w:eastAsia="en-GB"/>
+        </w:rPr>
+        <w:fldChar w:fldCharType="separate"/>
+      </w:r>
+      <w:r>
+        <w:rPr>
+          <w:lang w:val="en-HU" w:eastAsia="en-GB"/>
+        </w:rPr>
+        <w:t>[13.]</w:t>
+      </w:r>
+      <w:r>
+        <w:rPr>
+          <w:lang w:val="en-HU" w:eastAsia="en-GB"/>
+        </w:rPr>
+        <w:fldChar w:fldCharType="end"/>
+      </w:r>
+      <w:r>
+        <w:rPr>
+          <w:lang w:val="en-HU" w:eastAsia="en-GB"/>
+        </w:rPr>
+        <w:t xml:space="preserve"> Az így összeállított, mintegy tízezer elemű tanító- és validáló adatbázis kellő heterogenitást biztosított a modell tanulásához.</w:t>
       </w:r>
     </w:p>
     <w:p>
@@ -7217,7 +7548,55 @@
           <w:noProof/>
           <w:lang w:val="en-HU"/>
         </w:rPr>
-        <w:t>A modellfejlesztés kezdeti szakaszában különböző, a feladatra potenciálisan alkalmas konvolúciós és transzformer-alapú architektúrákat vizsgáltam. Kiindulási pontként egy ImageNeten előtanított ResNet50 hálózatot alkalmaztam, amelyet kísérleti jelleggel SE (Squeeze-and-Excitation) blokkal egészítettem ki. A figyelemmechanizmus beépítése mérhető teljesítményjavulást eredményezett, ezért ezt a későbbi modellek esetében is megtartottam.</w:t>
+        <w:t>A modellfejlesztés kezdeti szakaszában különböző, a feladatra potenciálisan alkalmas konvolúciós és transzformer-alapú architektúrákat vizsgáltam. Kiindulási pontként egy ImageNeten előtanított ResNet50 hálózatot alkalmaztam, amelyet kísérleti jelleggel SE (Squeeze-and-Excitation) blokkal egészítettem ki.</w:t>
+      </w:r>
+      <w:r>
+        <w:rPr>
+          <w:noProof/>
+          <w:lang w:val="en-HU"/>
+        </w:rPr>
+        <w:fldChar w:fldCharType="begin"/>
+      </w:r>
+      <w:r>
+        <w:rPr>
+          <w:noProof/>
+          <w:lang w:val="en-HU"/>
+        </w:rPr>
+        <w:instrText xml:space="preserve"> REF _Ref216167367 \r \h </w:instrText>
+      </w:r>
+      <w:r>
+        <w:rPr>
+          <w:noProof/>
+          <w:lang w:val="en-HU"/>
+        </w:rPr>
+      </w:r>
+      <w:r>
+        <w:rPr>
+          <w:noProof/>
+          <w:lang w:val="en-HU"/>
+        </w:rPr>
+        <w:fldChar w:fldCharType="separate"/>
+      </w:r>
+      <w:r>
+        <w:rPr>
+          <w:noProof/>
+          <w:lang w:val="en-HU"/>
+        </w:rPr>
+        <w:t>[14.]</w:t>
+      </w:r>
+      <w:r>
+        <w:rPr>
+          <w:noProof/>
+          <w:lang w:val="en-HU"/>
+        </w:rPr>
+        <w:fldChar w:fldCharType="end"/>
+      </w:r>
+      <w:r>
+        <w:rPr>
+          <w:noProof/>
+          <w:lang w:val="en-HU"/>
+        </w:rPr>
+        <w:t xml:space="preserve"> A figyelemmechanizmus beépítése mérhető teljesítményjavulást eredményezett, ezért ezt a későbbi modellek esetében is megtartottam.</w:t>
       </w:r>
     </w:p>
     <w:p>
@@ -7510,7 +7889,48 @@
         <w:rPr>
           <w:lang w:val="en-HU"/>
         </w:rPr>
-        <w:t>A kísérletek eredményei alapján a végső architektúra gerincéül egy ImageNeten előtanított SEResNet152D hálózat szolgált. A modell valamennyi rétegében alkalmazott SE (Squeeze-and-Excitation) blokkok a csatornaszintű figyelemmechanizmus révén hatékonyan támogatják a releváns vizuális jellemzők kiemelését. A hálózat felső szakaszában megtartottam egy további, manuálisan beépített SE blokkot is, amely tovább erősítette a jellemzők szelekcióját, különösen a finom vizuális különbségek felismeréséhez szükséges feladatokban.</w:t>
+        <w:t>A kísérletek eredményei alapján a végső architektúra gerincéül egy ImageNeten előtanított SEResNet152D hálózat szolgált.</w:t>
+      </w:r>
+      <w:r>
+        <w:rPr>
+          <w:lang w:val="en-HU"/>
+        </w:rPr>
+        <w:fldChar w:fldCharType="begin"/>
+      </w:r>
+      <w:r>
+        <w:rPr>
+          <w:lang w:val="en-HU"/>
+        </w:rPr>
+        <w:instrText xml:space="preserve"> REF _Ref216167393 \r \h </w:instrText>
+      </w:r>
+      <w:r>
+        <w:rPr>
+          <w:lang w:val="en-HU"/>
+        </w:rPr>
+      </w:r>
+      <w:r>
+        <w:rPr>
+          <w:lang w:val="en-HU"/>
+        </w:rPr>
+        <w:fldChar w:fldCharType="separate"/>
+      </w:r>
+      <w:r>
+        <w:rPr>
+          <w:lang w:val="en-HU"/>
+        </w:rPr>
+        <w:t>[15.]</w:t>
+      </w:r>
+      <w:r>
+        <w:rPr>
+          <w:lang w:val="en-HU"/>
+        </w:rPr>
+        <w:fldChar w:fldCharType="end"/>
+      </w:r>
+      <w:r>
+        <w:rPr>
+          <w:lang w:val="en-HU"/>
+        </w:rPr>
+        <w:t xml:space="preserve"> A modell valamennyi rétegében alkalmazott SE (Squeeze-and-Excitation) blokkok a csatornaszintű figyelemmechanizmus révén hatékonyan támogatják a releváns vizuális jellemzők kiemelését. A hálózat felső szakaszában megtartottam egy további, manuálisan beépített SE blokkot is, amely tovább erősítette a jellemzők szelekcióját, különösen a finom vizuális különbségek felismeréséhez szükséges feladatokban.</w:t>
       </w:r>
     </w:p>
     <w:p>
@@ -8402,6 +8822,41 @@
         </w:rPr>
         <w:t xml:space="preserve"> rendszert alkalmaztam, amely a képi szövegelemek lokalizálását és karakteralapú felismerését biztosítja. A modell által visszaadott szövegdobozok olvasási sorrendje nem garantált, ezért a további feldolgozás konzisztenciája érdekében a detektált elemeket sorstruktúrába rendeztem: először függőleges, majd a sorokon belül vízszintes igazítással.</w:t>
       </w:r>
+      <w:r>
+        <w:rPr>
+          <w:lang w:val="en-HU"/>
+        </w:rPr>
+        <w:fldChar w:fldCharType="begin"/>
+      </w:r>
+      <w:r>
+        <w:rPr>
+          <w:lang w:val="en-HU"/>
+        </w:rPr>
+        <w:instrText xml:space="preserve"> REF _Ref216167413 \r \h </w:instrText>
+      </w:r>
+      <w:r>
+        <w:rPr>
+          <w:lang w:val="en-HU"/>
+        </w:rPr>
+      </w:r>
+      <w:r>
+        <w:rPr>
+          <w:lang w:val="en-HU"/>
+        </w:rPr>
+        <w:fldChar w:fldCharType="separate"/>
+      </w:r>
+      <w:r>
+        <w:rPr>
+          <w:lang w:val="en-HU"/>
+        </w:rPr>
+        <w:t>[16.]</w:t>
+      </w:r>
+      <w:r>
+        <w:rPr>
+          <w:lang w:val="en-HU"/>
+        </w:rPr>
+        <w:fldChar w:fldCharType="end"/>
+      </w:r>
     </w:p>
     <w:p>
       <w:pPr>
@@ -12048,6 +12503,7 @@
           <w:lang w:val="en-HU"/>
         </w:rPr>
       </w:pPr>
+      <w:bookmarkStart w:id="39" w:name="_Ref216166996"/>
       <w:proofErr w:type="spellStart"/>
       <w:r>
         <w:rPr>
@@ -12245,6 +12701,7 @@
         </w:rPr>
         <w:t xml:space="preserve"> (Letöltve: 2025.05.02).</w:t>
       </w:r>
+      <w:bookmarkEnd w:id="39"/>
     </w:p>
     <w:p>
       <w:pPr>
@@ -12258,6 +12715,7 @@
           <w:lang w:val="en-HU"/>
         </w:rPr>
       </w:pPr>
+      <w:bookmarkStart w:id="40" w:name="_Ref216167022"/>
       <w:r>
         <w:rPr>
           <w:i/>
@@ -12265,6 +12723,7 @@
         </w:rPr>
         <w:t>Burkov, A. (2019). The Hundred-Page Machine Learning Book. ISBN 199957950X.</w:t>
       </w:r>
+      <w:bookmarkEnd w:id="40"/>
     </w:p>
     <w:p>
       <w:pPr>
@@ -12279,6 +12738,7 @@
           <w:lang w:val="en-HU"/>
         </w:rPr>
       </w:pPr>
+      <w:bookmarkStart w:id="41" w:name="_Ref216167095"/>
       <w:proofErr w:type="spellStart"/>
       <w:r>
         <w:rPr>
@@ -12439,6 +12899,7 @@
         </w:rPr>
         <w:t>.</w:t>
       </w:r>
+      <w:bookmarkEnd w:id="41"/>
     </w:p>
     <w:p>
       <w:pPr>
@@ -12453,6 +12914,7 @@
           <w:lang w:val="en-HU"/>
         </w:rPr>
       </w:pPr>
+      <w:bookmarkStart w:id="42" w:name="_Ref216167122"/>
       <w:proofErr w:type="spellStart"/>
       <w:r>
         <w:rPr>
@@ -12552,6 +13014,7 @@
         </w:rPr>
         <w:t>(Letöltve: 2025.05.02).</w:t>
       </w:r>
+      <w:bookmarkEnd w:id="42"/>
     </w:p>
     <w:p>
       <w:pPr>
@@ -12566,6 +13029,7 @@
           <w:lang w:val="en-HU"/>
         </w:rPr>
       </w:pPr>
+      <w:bookmarkStart w:id="43" w:name="_Ref216167158"/>
       <w:proofErr w:type="spellStart"/>
       <w:r>
         <w:rPr>
@@ -12697,6 +13161,7 @@
         </w:rPr>
         <w:t>(Letöltve: 2025.05.02).</w:t>
       </w:r>
+      <w:bookmarkEnd w:id="43"/>
     </w:p>
     <w:p>
       <w:pPr>
@@ -12711,6 +13176,7 @@
           <w:lang w:val="en-HU"/>
         </w:rPr>
       </w:pPr>
+      <w:bookmarkStart w:id="44" w:name="_Ref216167173"/>
       <w:proofErr w:type="spellStart"/>
       <w:r>
         <w:rPr>
@@ -12754,6 +13220,7 @@
         </w:rPr>
         <w:t xml:space="preserve"> (Letöltve: 2025.05.02).</w:t>
       </w:r>
+      <w:bookmarkEnd w:id="44"/>
       <w:r>
         <w:rPr>
           <w:i/>
@@ -12775,6 +13242,7 @@
           <w:lang w:val="en-HU"/>
         </w:rPr>
       </w:pPr>
+      <w:bookmarkStart w:id="45" w:name="_Ref216167190"/>
       <w:proofErr w:type="spellStart"/>
       <w:r>
         <w:rPr>
@@ -12853,6 +13321,7 @@
         </w:rPr>
         <w:t>(Letöltve: 2025.05.02).</w:t>
       </w:r>
+      <w:bookmarkEnd w:id="45"/>
     </w:p>
     <w:p>
       <w:pPr>
@@ -12867,6 +13336,7 @@
           <w:lang w:val="en-HU"/>
         </w:rPr>
       </w:pPr>
+      <w:bookmarkStart w:id="46" w:name="_Ref216167206"/>
       <w:r>
         <w:rPr>
           <w:i/>
@@ -12947,6 +13417,7 @@
         </w:rPr>
         <w:t>(Letöltve: 2025.05.02).</w:t>
       </w:r>
+      <w:bookmarkEnd w:id="46"/>
     </w:p>
     <w:p>
       <w:pPr>
@@ -12961,6 +13432,7 @@
           <w:lang w:val="en-HU"/>
         </w:rPr>
       </w:pPr>
+      <w:bookmarkStart w:id="47" w:name="_Ref216167244"/>
       <w:proofErr w:type="spellStart"/>
       <w:r>
         <w:rPr>
@@ -13040,6 +13512,7 @@
         </w:rPr>
         <w:t>(Letöltve: 2025.05.02).</w:t>
       </w:r>
+      <w:bookmarkEnd w:id="47"/>
     </w:p>
     <w:p>
       <w:pPr>
@@ -13054,6 +13527,7 @@
           <w:lang w:val="en-HU"/>
         </w:rPr>
       </w:pPr>
+      <w:bookmarkStart w:id="48" w:name="_Ref216167246"/>
       <w:proofErr w:type="spellStart"/>
       <w:r>
         <w:rPr>
@@ -13140,6 +13614,7 @@
         </w:rPr>
         <w:t>(Letöltve: 2025.05.02).</w:t>
       </w:r>
+      <w:bookmarkEnd w:id="48"/>
     </w:p>
     <w:p>
       <w:pPr>
@@ -13154,6 +13629,7 @@
           <w:lang w:val="en-HU"/>
         </w:rPr>
       </w:pPr>
+      <w:bookmarkStart w:id="49" w:name="_Ref216167309"/>
       <w:proofErr w:type="spellStart"/>
       <w:r>
         <w:rPr>
@@ -13245,6 +13721,7 @@
       <w:r>
         <w:t>Letöltve: 2025.05.02).</w:t>
       </w:r>
+      <w:bookmarkEnd w:id="49"/>
     </w:p>
     <w:p>
       <w:pPr>
@@ -13259,6 +13736,7 @@
           <w:lang w:val="en-HU"/>
         </w:rPr>
       </w:pPr>
+      <w:bookmarkStart w:id="50" w:name="_Ref216167313"/>
       <w:proofErr w:type="spellStart"/>
       <w:r>
         <w:rPr>
@@ -13330,6 +13808,7 @@
         </w:rPr>
         <w:t>Letöltve: 2025.05.02).</w:t>
       </w:r>
+      <w:bookmarkEnd w:id="50"/>
     </w:p>
     <w:p>
       <w:pPr>
@@ -13344,6 +13823,7 @@
           <w:lang w:val="en-HU"/>
         </w:rPr>
       </w:pPr>
+      <w:bookmarkStart w:id="51" w:name="_Ref216167367"/>
       <w:r>
         <w:rPr>
           <w:i/>
@@ -13452,6 +13932,7 @@
         </w:rPr>
         <w:t>(Letöltve: 2025.05.02).</w:t>
       </w:r>
+      <w:bookmarkEnd w:id="51"/>
     </w:p>
     <w:p>
       <w:pPr>
@@ -13466,6 +13947,7 @@
           <w:lang w:val="en-HU"/>
         </w:rPr>
       </w:pPr>
+      <w:bookmarkStart w:id="52" w:name="_Ref216167393"/>
       <w:r>
         <w:rPr>
           <w:i/>
@@ -13550,6 +14032,7 @@
         </w:rPr>
         <w:t>Letöltve: 2025.05.02).</w:t>
       </w:r>
+      <w:bookmarkEnd w:id="52"/>
     </w:p>
     <w:p>
       <w:pPr>
@@ -13564,6 +14047,7 @@
           <w:lang w:val="en-HU"/>
         </w:rPr>
       </w:pPr>
+      <w:bookmarkStart w:id="53" w:name="_Ref216167413"/>
       <w:proofErr w:type="spellStart"/>
       <w:r>
         <w:rPr>
@@ -13733,6 +14217,7 @@
         </w:rPr>
         <w:t>Letöltve: 2025.05.02).</w:t>
       </w:r>
+      <w:bookmarkEnd w:id="53"/>
     </w:p>
     <w:p>
       <w:pPr>
@@ -13748,25 +14233,25 @@
       <w:pPr>
         <w:pStyle w:val="Fejezetcimszmozsnlkl"/>
       </w:pPr>
-      <w:bookmarkStart w:id="39" w:name="_Toc216099406"/>
+      <w:bookmarkStart w:id="54" w:name="_Toc216099406"/>
       <w:r>
         <w:lastRenderedPageBreak/>
         <w:t>Függelék</w:t>
       </w:r>
-      <w:bookmarkEnd w:id="39"/>
+      <w:bookmarkEnd w:id="54"/>
     </w:p>
     <w:p>
       <w:pPr>
         <w:pStyle w:val="Heading2"/>
       </w:pPr>
-      <w:bookmarkStart w:id="40" w:name="_Toc216099407"/>
+      <w:bookmarkStart w:id="55" w:name="_Toc216099407"/>
       <w:r>
         <w:t xml:space="preserve">5.1 Márkák </w:t>
       </w:r>
       <w:r>
         <w:t>listája</w:t>
       </w:r>
-      <w:bookmarkEnd w:id="40"/>
+      <w:bookmarkEnd w:id="55"/>
     </w:p>
     <w:p/>
     <w:p/>
@@ -13774,7 +14259,7 @@
       <w:pPr>
         <w:pStyle w:val="Heading2"/>
       </w:pPr>
-      <w:bookmarkStart w:id="41" w:name="_Toc216099408"/>
+      <w:bookmarkStart w:id="56" w:name="_Toc216099408"/>
       <w:r>
         <w:t>5.</w:t>
       </w:r>
@@ -13784,7 +14269,7 @@
       <w:r>
         <w:t xml:space="preserve"> Márka szinonima lista</w:t>
       </w:r>
-      <w:bookmarkEnd w:id="41"/>
+      <w:bookmarkEnd w:id="56"/>
     </w:p>
     <w:p>
       <w:pPr>
@@ -15835,7 +16320,7 @@
       <w:pPr>
         <w:pStyle w:val="Heading2"/>
       </w:pPr>
-      <w:bookmarkStart w:id="42" w:name="_Toc216099409"/>
+      <w:bookmarkStart w:id="57" w:name="_Toc216099409"/>
       <w:r>
         <w:lastRenderedPageBreak/>
         <w:t>5.</w:t>
@@ -15862,7 +16347,7 @@
       <w:r>
         <w:t xml:space="preserve"> idődiagramok</w:t>
       </w:r>
-      <w:bookmarkEnd w:id="42"/>
+      <w:bookmarkEnd w:id="57"/>
     </w:p>
     <w:p>
       <w:pPr>
@@ -16660,7 +17145,7 @@
       <w:pPr>
         <w:pStyle w:val="Heading2"/>
       </w:pPr>
-      <w:bookmarkStart w:id="43" w:name="_Toc216099410"/>
+      <w:bookmarkStart w:id="58" w:name="_Toc216099410"/>
       <w:r>
         <w:t>5</w:t>
       </w:r>
@@ -16670,7 +17155,7 @@
       <w:r>
         <w:t xml:space="preserve"> Korrelációs mátrixok</w:t>
       </w:r>
-      <w:bookmarkEnd w:id="43"/>
+      <w:bookmarkEnd w:id="58"/>
     </w:p>
     <w:p>
       <w:pPr>
@@ -16832,7 +17317,7 @@
       <w:pPr>
         <w:pStyle w:val="Heading2"/>
       </w:pPr>
-      <w:bookmarkStart w:id="44" w:name="_Toc216099411"/>
+      <w:bookmarkStart w:id="59" w:name="_Toc216099411"/>
       <w:r>
         <w:t>5.</w:t>
       </w:r>
@@ -16861,7 +17346,7 @@
       <w:r>
         <w:t xml:space="preserve"> + CLIP)</w:t>
       </w:r>
-      <w:bookmarkEnd w:id="44"/>
+      <w:bookmarkEnd w:id="59"/>
       <w:r>
         <w:t xml:space="preserve"> </w:t>
       </w:r>
@@ -16998,7 +17483,7 @@
       <w:pPr>
         <w:pStyle w:val="Heading2"/>
       </w:pPr>
-      <w:bookmarkStart w:id="45" w:name="_Toc216099412"/>
+      <w:bookmarkStart w:id="60" w:name="_Toc216099412"/>
       <w:r>
         <w:lastRenderedPageBreak/>
         <w:t>5.</w:t>
@@ -17009,7 +17494,7 @@
       <w:r>
         <w:t>. Diagnosztikai elemzések</w:t>
       </w:r>
-      <w:bookmarkEnd w:id="45"/>
+      <w:bookmarkEnd w:id="60"/>
       <w:r>
         <w:t xml:space="preserve"> </w:t>
       </w:r>
@@ -18075,7 +18560,7 @@
       <w:pPr>
         <w:pStyle w:val="Heading2"/>
       </w:pPr>
-      <w:bookmarkStart w:id="46" w:name="_Toc216099413"/>
+      <w:bookmarkStart w:id="61" w:name="_Toc216099413"/>
       <w:r>
         <w:lastRenderedPageBreak/>
         <w:t>5.</w:t>
@@ -18094,7 +18579,7 @@
       <w:r>
         <w:t xml:space="preserve"> tartalmazó TWFE specifikációk</w:t>
       </w:r>
-      <w:bookmarkEnd w:id="46"/>
+      <w:bookmarkEnd w:id="61"/>
     </w:p>
     <w:p>
       <w:pPr>
@@ -23748,7 +24233,7 @@
 </file>
 
 <file path=customXml/itemProps1.xml><?xml version="1.0" encoding="utf-8"?>
-<ds:datastoreItem xmlns:ds="http://schemas.openxmlformats.org/officeDocument/2006/customXml" ds:itemID="{822109D3-722B-144A-82DA-D2DC682E60FE}">
+<ds:datastoreItem xmlns:ds="http://schemas.openxmlformats.org/officeDocument/2006/customXml" ds:itemID="{3BBF10C0-7364-6C4B-8E7A-253F17A72469}">
   <ds:schemaRefs>
     <ds:schemaRef ds:uri="http://schemas.openxmlformats.org/officeDocument/2006/bibliography"/>
   </ds:schemaRefs>

</xml_diff>